<commit_message>
fix(templates): decision 1.4 names the employer's legal representative
Art. 2 points 3 to 5 named the legal representative of an administrator; the decision is the
employer's.

Claude-Session: https://claude.ai/code/session_01A9qjCHVH6kcDAEKFiJoShR
</commit_message>
<xml_diff>
--- a/packages/document-engine/templates/1.4_decision_imminent_danger.docx
+++ b/packages/document-engine/templates/1.4_decision_imminent_danger.docx
@@ -455,31 +455,7 @@
           <w:szCs w:val="20"/>
           <w:lang w:val="ro-RO"/>
         </w:rPr>
-        <w:t xml:space="preserve">Pentru asigurarea </w:t>
-      </w:r>
-      <w:r>
-        <w:rPr>
-          <w:rFonts w:eastAsia="Arial" w:cs="Arial" w:ascii="Arial" w:hAnsi="Arial"/>
-          <w:color w:val="auto"/>
-          <w:spacing w:val="0"/>
-          <w:w w:val="100"/>
-          <w:sz w:val="20"/>
-          <w:szCs w:val="20"/>
-          <w:lang w:val="ro-RO" w:eastAsia="en-US"/>
-        </w:rPr>
-        <w:t xml:space="preserve">mijloacelor de comunicare necesare contactării serviciilor specializate: </w:t>
-      </w:r>
-      <w:r>
-        <w:rPr>
-          <w:rFonts w:eastAsia="Arial" w:cs="Arial" w:ascii="Arial" w:hAnsi="Arial"/>
-          <w:color w:val="auto"/>
-          <w:spacing w:val="0"/>
-          <w:w w:val="100"/>
-          <w:sz w:val="20"/>
-          <w:szCs w:val="20"/>
-          <w:lang w:val="ro-RO"/>
-        </w:rPr>
-        <w:t xml:space="preserve">personalul desemnat sau reprezentantul legal al administratorului;</w:t>
+        <w:t xml:space="preserve">Pentru asigurarea mijloacelor de comunicare necesare contactării serviciilor specializate: personalul desemnat sau reprezentantul legal al angajatorului;</w:t>
       </w:r>
     </w:p>
     <w:p>
@@ -508,19 +484,7 @@
           <w:szCs w:val="20"/>
           <w:lang w:val="ro-RO" w:eastAsia="en-US"/>
         </w:rPr>
-        <w:t xml:space="preserve">Pentru modul operativ de anunțare la nivel ierarhic superior: </w:t>
-      </w:r>
-      <w:r>
-        <w:rPr>
-          <w:rFonts w:eastAsia="Arial" w:cs="Arial" w:ascii="Arial" w:hAnsi="Arial"/>
-          <w:color w:val="auto"/>
-          <w:spacing w:val="0"/>
-          <w:w w:val="100"/>
-          <w:sz w:val="20"/>
-          <w:szCs w:val="20"/>
-          <w:lang w:val="ro-RO"/>
-        </w:rPr>
-        <w:t xml:space="preserve">personalul desemnat sau reprezentantul legal al administratorului;</w:t>
+        <w:t xml:space="preserve">Pentru modul operativ de anunțare la nivel ierarhic superior: personalul desemnat sau reprezentantul legal al angajatorului;</w:t>
       </w:r>
     </w:p>
     <w:p>
@@ -549,19 +513,7 @@
           <w:szCs w:val="20"/>
           <w:lang w:val="ro-RO" w:eastAsia="en-US"/>
         </w:rPr>
-        <w:t xml:space="preserve">Pentru eliminarea stării de pericol grav și iminent, asigurarea instruirii, dotarea cu mijloace tehnice necesare intervenției și stabilirea serviciilor specializate care pot interveni: </w:t>
-      </w:r>
-      <w:r>
-        <w:rPr>
-          <w:rFonts w:eastAsia="Arial" w:cs="Arial" w:ascii="Arial" w:hAnsi="Arial"/>
-          <w:color w:val="auto"/>
-          <w:spacing w:val="0"/>
-          <w:w w:val="100"/>
-          <w:sz w:val="20"/>
-          <w:szCs w:val="20"/>
-          <w:lang w:val="ro-RO"/>
-        </w:rPr>
-        <w:t xml:space="preserve">personalul desemnat sau reprezentantul legal al administratorului.</w:t>
+        <w:t xml:space="preserve">Pentru eliminarea stării de pericol grav și iminent, asigurarea instruirii, dotarea cu mijloace tehnice necesare intervenției și stabilirea serviciilor specializate care pot interveni: personalul desemnat sau reprezentantul legal al angajatorului.</w:t>
       </w:r>
     </w:p>
     <w:p>

</xml_diff>

<commit_message>
fix(templates): the imminent danger decision cites "alin. (1)–(5)"
The preamble cites "Art. 103, alin. (1)–(5)" (was "(1-5)") and sets the
representative off with a comma; Art. 1 pt 1 reads "oprirea echipamentului
de muncă și/ sau a activității".

Claude-Session: https://claude.ai/code/session_01A9qjCHVH6kcDAEKFiJoShR
</commit_message>
<xml_diff>
--- a/packages/document-engine/templates/1.4_decision_imminent_danger.docx
+++ b/packages/document-engine/templates/1.4_decision_imminent_danger.docx
@@ -93,7 +93,7 @@
           <w:szCs w:val="20"/>
           <w:lang w:val="ro-RO"/>
         </w:rPr>
-        <w:t xml:space="preserve">În baza prevederilor legale în domeniul securității și sănătății în muncă din Legea 319/ 2006 Art. 11, alin. (1), lit. b) și din H.G. 1425/ 2006 Art. 103, alin. (1-5), {{client.representativeName}} în calitate de {{client.representativeRole}} în cadrul {{client.legalName}}, începând cu data de {{issueDate}},</w:t>
+        <w:t xml:space="preserve">În baza prevederilor legale în domeniul securității și sănătății în muncă din Legea 319/ 2006 Art. 11, alin. (1), lit. b) și din H.G. 1425/ 2006 Art. 103, alin. (1)–(5), {{client.representativeName}}, în calitate de {{client.representativeRole}} în cadrul {{client.legalName}}, începând cu data de {{issueDate}},</w:t>
       </w:r>
     </w:p>
     <w:p>
@@ -206,7 +206,7 @@
           <w:szCs w:val="20"/>
           <w:lang w:val="ro-RO" w:eastAsia="en-US"/>
         </w:rPr>
-        <w:t>oprirea echipamentului de muncă și/sau activității;</w:t>
+        <w:t xml:space="preserve">oprirea echipamentului de muncă și/ sau a activității;</w:t>
       </w:r>
     </w:p>
     <w:p>

</xml_diff>